<commit_message>
Mengumpulkan tugas pekan 06
</commit_message>
<xml_diff>
--- a/Pekan-05/707012500042_Mochammad Eyckies Bintang Satryaz.docx
+++ b/Pekan-05/707012500042_Mochammad Eyckies Bintang Satryaz.docx
@@ -62,7 +62,7 @@
           <w:noProof/>
         </w:rPr>
         <w:drawing>
-          <wp:inline distT="0" distB="0" distL="0" distR="0" wp14:anchorId="16A3C472" wp14:editId="6F2A3947">
+          <wp:inline distT="0" distB="0" distL="0" distR="0" wp14:anchorId="16A3C472" wp14:editId="3D822A06">
             <wp:extent cx="2676525" cy="3048000"/>
             <wp:effectExtent l="0" t="0" r="0" b="0"/>
             <wp:docPr id="1938492422" name="Picture 10"/>
@@ -3655,27 +3655,7 @@
           <w:lang w:eastAsia="en-ID"/>
           <w14:ligatures w14:val="none"/>
         </w:rPr>
-        <w:t xml:space="preserve"> </w:t>
-      </w:r>
-      <w:proofErr w:type="spellStart"/>
-      <w:r>
-        <w:rPr>
-          <w:rFonts w:asciiTheme="majorHAnsi" w:eastAsia="Times New Roman" w:hAnsiTheme="majorHAnsi" w:cs="Arial"/>
-          <w:kern w:val="0"/>
-          <w:lang w:eastAsia="en-ID"/>
-          <w14:ligatures w14:val="none"/>
-        </w:rPr>
-        <w:t>ke</w:t>
-      </w:r>
-      <w:proofErr w:type="spellEnd"/>
-      <w:r>
-        <w:rPr>
-          <w:rFonts w:asciiTheme="majorHAnsi" w:eastAsia="Times New Roman" w:hAnsiTheme="majorHAnsi" w:cs="Arial"/>
-          <w:kern w:val="0"/>
-          <w:lang w:eastAsia="en-ID"/>
-          <w14:ligatures w14:val="none"/>
-        </w:rPr>
-        <w:t xml:space="preserve"> folder upload.</w:t>
+        <w:t xml:space="preserve"> ke folder upload.</w:t>
       </w:r>
     </w:p>
     <w:p>
@@ -4027,6 +4007,7 @@
           <w:ilvl w:val="0"/>
           <w:numId w:val="30"/>
         </w:numPr>
+        <w:ind w:left="1440"/>
         <w:jc w:val="both"/>
         <w:rPr>
           <w:rFonts w:asciiTheme="majorHAnsi" w:hAnsiTheme="majorHAnsi"/>
@@ -4061,7 +4042,7 @@
           <w:ilvl w:val="0"/>
           <w:numId w:val="31"/>
         </w:numPr>
-        <w:ind w:left="1440"/>
+        <w:ind w:left="1800"/>
         <w:jc w:val="both"/>
         <w:rPr>
           <w:rFonts w:asciiTheme="majorHAnsi" w:hAnsiTheme="majorHAnsi"/>
@@ -4103,7 +4084,7 @@
           <w:ilvl w:val="0"/>
           <w:numId w:val="31"/>
         </w:numPr>
-        <w:ind w:left="1440"/>
+        <w:ind w:left="1800"/>
         <w:jc w:val="both"/>
         <w:rPr>
           <w:rFonts w:asciiTheme="majorHAnsi" w:hAnsiTheme="majorHAnsi"/>
@@ -4145,7 +4126,7 @@
           <w:ilvl w:val="0"/>
           <w:numId w:val="31"/>
         </w:numPr>
-        <w:ind w:left="1440"/>
+        <w:ind w:left="1800"/>
         <w:jc w:val="both"/>
         <w:rPr>
           <w:rFonts w:asciiTheme="majorHAnsi" w:hAnsiTheme="majorHAnsi"/>
@@ -4173,7 +4154,7 @@
           <w:ilvl w:val="0"/>
           <w:numId w:val="31"/>
         </w:numPr>
-        <w:ind w:left="1440"/>
+        <w:ind w:left="1800"/>
         <w:jc w:val="both"/>
         <w:rPr>
           <w:rFonts w:asciiTheme="majorHAnsi" w:hAnsiTheme="majorHAnsi"/>
@@ -4201,7 +4182,7 @@
           <w:ilvl w:val="0"/>
           <w:numId w:val="31"/>
         </w:numPr>
-        <w:ind w:left="1440"/>
+        <w:ind w:left="1800"/>
         <w:jc w:val="both"/>
         <w:rPr>
           <w:rFonts w:asciiTheme="majorHAnsi" w:hAnsiTheme="majorHAnsi"/>
@@ -4264,6 +4245,7 @@
           <w:rFonts w:asciiTheme="majorHAnsi" w:hAnsiTheme="majorHAnsi"/>
           <w:b/>
           <w:bCs/>
+          <w:noProof/>
         </w:rPr>
         <w:lastRenderedPageBreak/>
         <w:drawing>
@@ -4315,6 +4297,7 @@
       <w:r>
         <w:rPr>
           <w:rFonts w:asciiTheme="majorHAnsi" w:hAnsiTheme="majorHAnsi"/>
+          <w:noProof/>
         </w:rPr>
         <w:drawing>
           <wp:inline distT="0" distB="0" distL="0" distR="0" wp14:anchorId="47FFB423" wp14:editId="4656132B">
@@ -10306,6 +10289,7 @@
   <w:style w:type="character" w:default="1" w:styleId="DefaultParagraphFont">
     <w:name w:val="Default Paragraph Font"/>
     <w:uiPriority w:val="1"/>
+    <w:semiHidden/>
     <w:unhideWhenUsed/>
   </w:style>
   <w:style w:type="table" w:default="1" w:styleId="TableNormal">

</xml_diff>